<commit_message>
i*: close the SD/SR consistency gap and sync the quoted count
- apply-istar-consistency-fix.py: adds the three dependencies the case study requires
  (paras 5, 7 and 27), so the SD goes from 37 to 40, and fixes the two SR boundary links
  that named or attributed a dependency differently from the SD. validate-istar.py now
  reports 9/9 boundary links matching the SD, where the portfolio claimed consistency
- update-sd-count.py: 37 -> 40 in the portfolio, the agile record, the work division and
  the combined portfolio, at run level so formatting survives
- the SD and SR figures also quoted two stale actor counts in their annotation bands;
  corrected in place. Both figures still need re-exporting from the model.
- piStar projects now stamp tool=pistar.2.1.0, the version the live tool reports, because
  the loader reads that field to decide how to load the file
</commit_message>
<xml_diff>
--- a/07_Portfolio_Documents/UFCEP4-0-3_01_Task01_02_Strategic_BPMN_and_iStar.docx
+++ b/07_Portfolio_Documents/UFCEP4-0-3_01_Task01_02_Strategic_BPMN_and_iStar.docx
@@ -3417,7 +3417,7 @@
         <w:rPr>
           <w:b/>
         </w:rPr>
-        <w:t xml:space="preserve">16 actors and 37 dependencies</w:t>
+        <w:t>16 actors and 40 dependencies</w:t>
       </w:r>
       <w:r>
         <w:t xml:space="preserve">, each typed as a goal, soft goal, task or resource.</w:t>
@@ -3552,7 +3552,7 @@
         <w:t xml:space="preserve">Dependency count.</w:t>
       </w:r>
       <w:r>
-        <w:t xml:space="preserve"> Thirty-seven dependencies across sixteen actors is a deliberately bounded model. Adding a dependency for every exchange in the process models would produce a diagram with no analytic value; the criterion applied was whether the exchange represents something one actor needs from another that it cannot produce itself.</w:t>
+        <w:t xml:space="preserve"> Forty dependencies across sixteen actors is a deliberately bounded model. Adding a dependency for every exchange in the process models would produce a diagram with no analytic value; the criterion applied was whether the exchange represents something one actor needs from another that it cannot produce itself.</w:t>
       </w:r>
     </w:p>
     <w:p>
@@ -3599,7 +3599,7 @@
         <w:rPr>
           <w:i/>
         </w:rPr>
-        <w:t xml:space="preserve">Figure 5. i* SD model: 16 actors and 37 typed dependencies. Editable source: `06_iStar_Models/iStar_SD_Initial_Release.svg`.</w:t>
+        <w:t>Figure 5. i* SD model: 16 actors and 40 typed dependencies. Editable source: `06_iStar_Models/iStar_SD_Initial_Release.svg`.</w:t>
       </w:r>
     </w:p>
     <w:p>

</xml_diff>